<commit_message>
Update English alignment data for 2026-08-24 release
</commit_message>
<xml_diff>
--- a/eng/docx/11.content.docx
+++ b/eng/docx/11.content.docx
@@ -5329,7 +5329,7 @@
         <w:rPr>
           <w:lang w:val="en_US" w:bidi="en_US"/>
         </w:rPr>
-        <w:t xml:space="preserve"> And he made a cast sea, ten by the cubit from its lip to its lip, circular all around. And five by the cubit was its height, and a cord of 30 cubits surrounded it all around.</w:t>
+        <w:t xml:space="preserve"> And he made a cast sea, ten by the cubit from its lip to its lip, circular around. And five by the cubit was its height, and a cord of thirty by the cubit surrounded it around.</w:t>
       </w:r>
     </w:p>
     <w:p>
@@ -5833,7 +5833,7 @@
         <w:rPr>
           <w:lang w:val="en_US" w:bidi="en_US"/>
         </w:rPr>
-        <w:t xml:space="preserve"> And Solomon let all of the vessels rest, from great, great abundance. The weight of the bronze was not determined.</w:t>
+        <w:t xml:space="preserve"> And Solomon let all of the vessels rest, from great, great abundance. The weight of the bronze was not sought out.</w:t>
       </w:r>
     </w:p>
     <w:p>
@@ -7298,7 +7298,7 @@
         <w:rPr>
           <w:lang w:val="en_US" w:bidi="en_US"/>
         </w:rPr>
-        <w:t xml:space="preserve"> And Solomon observed the feast at that time, and all of Israel with him, a great assembly, from Lebo Hamath to the wadi of Egypt, to the face of Yahweh our God, seven days and seven days, fourteen days.</w:t>
+        <w:t xml:space="preserve"> And Solomon made the feast at that time, and all of Israel with him, a great assembly, from Lebo Hamath to the wadi of Egypt, to the face of Yahweh our God, seven days and seven days, fourteen days.</w:t>
       </w:r>
     </w:p>
     <w:p>
@@ -7461,7 +7461,7 @@
         <w:rPr>
           <w:lang w:val="en_US" w:bidi="en_US"/>
         </w:rPr>
-        <w:t xml:space="preserve"> If turning, you turn, you or your sons, from after me, and you do not keep my commandments, my statutes that I have set to your faces, and you go and serve other gods and bow down to them,</w:t>
+        <w:t xml:space="preserve"> If turning, you turn, you or your sons, from after me, and you do not keep my commandments, my statutes that I have set to your faces, and you go and serve other gods and prostrate yourselves to them,</w:t>
       </w:r>
     </w:p>
     <w:p>
@@ -7503,7 +7503,7 @@
         <w:rPr>
           <w:lang w:val="en_US" w:bidi="en_US"/>
         </w:rPr>
-        <w:t xml:space="preserve"> And this house is exalted, everyone passing by it will be astonished and will hiss. And they will say, ‘Why did Yahweh do thus to this land and to this house?’</w:t>
+        <w:t xml:space="preserve"> And this house {that} is exalted, everyone passing by it will be appalled and will hiss. And they will say, ‘Why did Yahweh do thus to this land and to this house?’</w:t>
       </w:r>
     </w:p>
     <w:p>
@@ -7524,7 +7524,7 @@
         <w:rPr>
           <w:lang w:val="en_US" w:bidi="en_US"/>
         </w:rPr>
-        <w:t xml:space="preserve"> And they will say, ‘Because they forsook Yahweh their God, who brought their fathers out from the land of Egypt, and they held onto other gods and bowed down to them and served them. Therefore Yahweh brought upon them all of this harm.’”</w:t>
+        <w:t xml:space="preserve"> And they will say, ‘Because they forsook Yahweh their God, who brought their fathers out from the land of Egypt, and they held onto other gods and prostrated themselves to them and served them. Therefore Yahweh brought upon them all of this harm.’”</w:t>
       </w:r>
     </w:p>
     <w:p>
@@ -7755,7 +7755,7 @@
         <w:rPr>
           <w:lang w:val="en_US" w:bidi="en_US"/>
         </w:rPr>
-        <w:t xml:space="preserve"> All of the people, the ones being left from the Amorite, the Hittite, the Perizzite, the Hivite, and the Jebusite, they who {were} not from the sons of Israel,</w:t>
+        <w:t xml:space="preserve"> All of the people being left from the Amorite, the Hittite, the Perizzite, the Hivite, and the Jebusite, they who {were} not from the sons of Israel,</w:t>
       </w:r>
     </w:p>
     <w:p>
@@ -7797,7 +7797,7 @@
         <w:rPr>
           <w:lang w:val="en_US" w:bidi="en_US"/>
         </w:rPr>
-        <w:t xml:space="preserve"> But from the sons of Israel Solomon did not make a servant, for they {were} the men of war and his servants and his commanders and his captains and the commanders of his chariotry and his horsemen.</w:t>
+        <w:t xml:space="preserve"> But from the sons of Israel Solomon did not make a servant, for they {were} men of war and his servants and his commanders and his captains and the commanders of his chariotry and his horsemen.</w:t>
       </w:r>
     </w:p>
     <w:p>
@@ -7818,7 +7818,7 @@
         <w:rPr>
           <w:lang w:val="en_US" w:bidi="en_US"/>
         </w:rPr>
-        <w:t xml:space="preserve"> These {were} the commanders of the deputies who {were} over the work for Solomon, 550, the ones ruling over the people doing the work.</w:t>
+        <w:t xml:space="preserve"> These {were} the commanders of the deputies who {were} over the work for Solomon, 550, ruling over the people doing the work.</w:t>
       </w:r>
     </w:p>
     <w:p>
@@ -8212,7 +8212,7 @@
         <w:rPr>
           <w:lang w:val="en_US" w:bidi="en_US"/>
         </w:rPr>
-        <w:t xml:space="preserve"> And King Solomon gave to the Queen of Sheba all of her delight, whatever she requested, besides what he gave to her according to the hand of King Solomon. And she turned and went to her land, she and her servants.</w:t>
+        <w:t xml:space="preserve"> And King Solomon gave to the Queen of Sheba all of her desire that she asked, besides what he gave to her according to the hand of King Solomon. And she turned and went to her land, she and her servants.</w:t>
       </w:r>
     </w:p>
     <w:p>
@@ -8275,7 +8275,7 @@
         <w:rPr>
           <w:lang w:val="en_US" w:bidi="en_US"/>
         </w:rPr>
-        <w:t xml:space="preserve"> And King Solomon made 200 beaten-gold large shields, 600 gold went up onto one large shield,</w:t>
+        <w:t xml:space="preserve"> And King Solomon made 200 beaten-gold large shields (he brought up 600 gold onto one large shield)</w:t>
       </w:r>
     </w:p>
     <w:p>
@@ -8296,7 +8296,7 @@
         <w:rPr>
           <w:lang w:val="en_US" w:bidi="en_US"/>
         </w:rPr>
-        <w:t xml:space="preserve"> and 300 beaten-gold shields, three gold minas went up onto one shield. And the king put them {in} the House of the Forest of Lebanon.</w:t>
+        <w:t xml:space="preserve"> and 300 beaten-gold shields (he brought up three gold minas onto one shield). And the king put them {in} the House of the Forest of Lebanon.</w:t>
       </w:r>
     </w:p>
     <w:p>
@@ -8338,7 +8338,7 @@
         <w:rPr>
           <w:lang w:val="en_US" w:bidi="en_US"/>
         </w:rPr>
-        <w:t xml:space="preserve"> Six steps {were} to the throne, and a round head {was} to the throne from behind it. And hands {were} from this side and from that side to the place of the seat. And two lions were standing beside the hands.</w:t>
+        <w:t xml:space="preserve"> Six steps {were} to the throne, and a round head {was} to the throne from behind it. And hands {were} from this and from this to the place of the seat. And two lions were standing beside the hands.</w:t>
       </w:r>
     </w:p>
     <w:p>
@@ -8359,7 +8359,7 @@
         <w:rPr>
           <w:lang w:val="en_US" w:bidi="en_US"/>
         </w:rPr>
-        <w:t xml:space="preserve"> And 12 lions were standing there on the six steps, from this side and from that side. It was not made thus for any of the kingdoms.</w:t>
+        <w:t xml:space="preserve"> And 12 lions were standing there on the six steps, from this side and from that side. It had not been done thus for any of the kingdoms.</w:t>
       </w:r>
     </w:p>
     <w:p>
@@ -8527,7 +8527,7 @@
         <w:rPr>
           <w:lang w:val="en_US" w:bidi="en_US"/>
         </w:rPr>
-        <w:t xml:space="preserve"> And the going out of the horses that {were} to Solomon {was} from Egypt and from Kue. The traders of the king would take from Kue for a price.</w:t>
+        <w:t xml:space="preserve"> And the going out of the horses that {were} to Solomon {was} from Egypt and from Kue. The traders of the king took from Kue for a price.</w:t>
       </w:r>
     </w:p>
     <w:p>
@@ -9525,7 +9525,7 @@
         <w:rPr>
           <w:lang w:val="en_US" w:bidi="en_US"/>
         </w:rPr>
-        <w:t xml:space="preserve"> And it happened, when Jeroboam, the son of Nebat, heard (now he, he {was} still in Egypt, where he had fled from the face of King Solomon, and Jeroboam dwelled in Egypt),</w:t>
+        <w:t xml:space="preserve"> And it happened when Jeroboam, the son of Nebat, heard (now he, he {was} still in Egypt, where he had fled from the face of King Solomon, and Jeroboam dwelled in Egypt),</w:t>
       </w:r>
     </w:p>
     <w:p>
@@ -9672,7 +9672,7 @@
         <w:rPr>
           <w:lang w:val="en_US" w:bidi="en_US"/>
         </w:rPr>
-        <w:t xml:space="preserve"> And he said to them, “How are you advising that we should answer {with} a word this people who spoke to me saying, ‘Make lighter than the yoke that your father put on us’?”</w:t>
+        <w:t xml:space="preserve"> And he said to them, “How are you advising that we should return a word {to} this people who spoke to me saying, ‘Make lighter than the yoke that your father put on us’?”</w:t>
       </w:r>
     </w:p>
     <w:p>
@@ -9819,7 +9819,7 @@
         <w:rPr>
           <w:lang w:val="en_US" w:bidi="en_US"/>
         </w:rPr>
-        <w:t xml:space="preserve"> And all of Israel saw that the king had not listened to them, and the people answered the king {with} a word, saying, “What portion {is} to us in David? And no inheritance in the son of Jesse! To your tents, Israel! Now see your house, David.” And Israel went to its tents.</w:t>
+        <w:t xml:space="preserve"> And all of Israel saw that the king had not listened to them, and the people answered the king {with} a word, saying, “What portion {is} to us in David? And no inheritance in the son of Jesse! To your tents, Israel! Now see your house, David!” And Israel went to its tents.</w:t>
       </w:r>
     </w:p>
     <w:p>
@@ -9840,7 +9840,7 @@
         <w:rPr>
           <w:lang w:val="en_US" w:bidi="en_US"/>
         </w:rPr>
-        <w:t xml:space="preserve"> (But the sons of Israel, the ones dwelling in the cities of Judah, Rehoboam reigned over them.)</w:t>
+        <w:t xml:space="preserve"> (But the sons of Israel dwelling in the cities of Judah, Rehoboam reigned over them.)</w:t>
       </w:r>
     </w:p>
     <w:p>
@@ -11363,7 +11363,7 @@
         <w:rPr>
           <w:lang w:val="en_US" w:bidi="en_US"/>
         </w:rPr>
-        <w:t xml:space="preserve"> Now Rehoboam, the son of Solomon, reigned in Judah. Rehoboam {was} a son of 41 years when he became king. And he reigned 17 years in Jerusalem, the city where Yahweh had chosen to put his name there from all of the tribes of Israel. And the name of his mother was Naamah the Ammonitess.</w:t>
+        <w:t xml:space="preserve"> Now Rehoboam, the son of Solomon, reigned in Judah. Rehoboam {was} a son of 41 years when he reigned. And he reigned 17 years in Jerusalem, the city where Yahweh had chosen to put his name there from all of the tribes of Israel. And the name of his mother was Naamah the Ammonitess.</w:t>
       </w:r>
     </w:p>
     <w:p>
@@ -16825,7 +16825,7 @@
         <w:rPr>
           <w:lang w:val="en_US" w:bidi="en_US"/>
         </w:rPr>
-        <w:t xml:space="preserve"> And the messenger who went to call Micaiah spoke to him, saying, “Behold, please, the words of the prophets {with} one mouth {are} good for the king. Please let your word be like the word of one from them, and speak good.”</w:t>
+        <w:t xml:space="preserve"> And the messenger who went to call Micaiah spoke to him, saying, “Behold, please, the words of the prophets {with} one mouth {are} good for the king. Please let your word be like the word of one from them, and may you speak good.”</w:t>
       </w:r>
     </w:p>
     <w:p>
@@ -16909,7 +16909,7 @@
         <w:rPr>
           <w:lang w:val="en_US" w:bidi="en_US"/>
         </w:rPr>
-        <w:t xml:space="preserve"> And he said, “I saw all of Israel scattered on the hills like a flock when no shepherd is to them. And Yahweh said, ‘No masters {are} to these. Let them return, a man to his house, in peace.’”</w:t>
+        <w:t xml:space="preserve"> And he said, “I saw all of Israel scattered on the hills like a flock when no shepherd {is} to them. And Yahweh said, ‘No masters {are} to these. Let them return, a man to his house, in peace.’”</w:t>
       </w:r>
     </w:p>
     <w:p>
@@ -16951,7 +16951,7 @@
         <w:rPr>
           <w:lang w:val="en_US" w:bidi="en_US"/>
         </w:rPr>
-        <w:t xml:space="preserve"> And he said, “Therefore, hear the word of Yahweh. I saw Yahweh sitting on his throne, and the whole army of the heavens was standing beside him on his right and on his left.</w:t>
+        <w:t xml:space="preserve"> And he said, “Therefore, hear the word of Yahweh. I saw Yahweh sitting on his throne, and all of the army of the heavens was standing beside him on his right and on his left.</w:t>
       </w:r>
     </w:p>
     <w:p>
@@ -16972,7 +16972,7 @@
         <w:rPr>
           <w:lang w:val="en_US" w:bidi="en_US"/>
         </w:rPr>
-        <w:t xml:space="preserve"> And Yahweh said, ‘Who will deceive Ahab so that he may go up and fall {at} Ramoth Gilead?’ And this {one} said, ‘By thus,’ while that {one} was saying, ‘By thus.’</w:t>
+        <w:t xml:space="preserve"> And Yahweh said, ‘Who will deceive Ahab so that he may go up and fall {at} Ramoth Gilead?’ And this {one} said, ‘By thus,’ and that {one} was saying, ‘By thus.’</w:t>
       </w:r>
     </w:p>
     <w:p>
@@ -17203,7 +17203,7 @@
         <w:rPr>
           <w:lang w:val="en_US" w:bidi="en_US"/>
         </w:rPr>
-        <w:t xml:space="preserve"> Now the king of Aram had commanded the 32 commanders of the chariotry that was to him, saying, “You shall not fight with small or with great except with the king of Israel alone.”</w:t>
+        <w:t xml:space="preserve"> Now the king of Aram had commanded the 32 commanders of the chariotry that {was} to him, saying, “You shall not fight with small or with great except with the king of Israel alone.”</w:t>
       </w:r>
     </w:p>
     <w:p>
@@ -17266,7 +17266,7 @@
         <w:rPr>
           <w:lang w:val="en_US" w:bidi="en_US"/>
         </w:rPr>
-        <w:t xml:space="preserve"> But a man drew with the bow in his innocence, and he struck the king of Israel between the joints and between the armor. And he said to his charioteer, “Turn your hand and bring me out from the camp, for I am wounded.”</w:t>
+        <w:t xml:space="preserve"> But a man drew the bow in his innocence, and he struck the king of Israel between the joints and between the armor. And he said to his charioteer, “Turn your hand and bring me out from the camp, for I am wounded.”</w:t>
       </w:r>
     </w:p>
     <w:p>

</xml_diff>